<commit_message>
fix the validation before the peer review --ref https://www.notion.so/validation-239388b1b46b80f8a01ace7fd12a6b59
</commit_message>
<xml_diff>
--- a/submission/BRCA_NACT_pCR_BMC_med_imaging.docx
+++ b/submission/BRCA_NACT_pCR_BMC_med_imaging.docx
@@ -30,7 +30,7 @@
     </w:p>
     <w:p>
       <w:pPr>
-        <w:pStyle w:val="6"/>
+        <w:pStyle w:val="7"/>
         <w:spacing w:line="273" w:lineRule="auto"/>
       </w:pPr>
       <w:r>
@@ -991,8 +991,6 @@
           <w:w w:val="95"/>
         </w:rPr>
       </w:pPr>
-      <w:bookmarkStart w:id="60" w:name="_GoBack"/>
-      <w:bookmarkEnd w:id="60"/>
     </w:p>
     <w:p>
       <w:pPr>
@@ -9420,7 +9418,7 @@
               <w:txbxContent>
                 <w:tbl>
                   <w:tblPr>
-                    <w:tblStyle w:val="7"/>
+                    <w:tblStyle w:val="8"/>
                     <w:tblW w:w="0" w:type="auto"/>
                     <w:tblInd w:w="7" w:type="dxa"/>
                     <w:tblBorders>
@@ -9473,7 +9471,7 @@
                       </w:tcPr>
                       <w:p>
                         <w:pPr>
-                          <w:pStyle w:val="11"/>
+                          <w:pStyle w:val="12"/>
                           <w:spacing w:before="0"/>
                           <w:jc w:val="left"/>
                           <w:rPr>
@@ -9491,7 +9489,7 @@
                       </w:tcPr>
                       <w:p>
                         <w:pPr>
-                          <w:pStyle w:val="11"/>
+                          <w:pStyle w:val="12"/>
                           <w:spacing w:before="0" w:line="273" w:lineRule="exact"/>
                           <w:ind w:left="91" w:right="91"/>
                           <w:rPr>
@@ -9515,7 +9513,7 @@
                       </w:tcPr>
                       <w:p>
                         <w:pPr>
-                          <w:pStyle w:val="11"/>
+                          <w:pStyle w:val="12"/>
                           <w:spacing w:before="0" w:line="273" w:lineRule="exact"/>
                           <w:ind w:left="87" w:right="87"/>
                           <w:rPr>
@@ -9560,7 +9558,7 @@
                       </w:tcPr>
                       <w:p>
                         <w:pPr>
-                          <w:pStyle w:val="11"/>
+                          <w:pStyle w:val="12"/>
                           <w:spacing w:before="50"/>
                           <w:ind w:left="60" w:right="60"/>
                           <w:rPr>
@@ -9578,7 +9576,7 @@
                       </w:p>
                       <w:p>
                         <w:pPr>
-                          <w:pStyle w:val="11"/>
+                          <w:pStyle w:val="12"/>
                           <w:spacing w:before="23"/>
                           <w:ind w:left="60" w:right="60"/>
                           <w:rPr>
@@ -9602,7 +9600,7 @@
                       </w:tcPr>
                       <w:p>
                         <w:pPr>
-                          <w:pStyle w:val="11"/>
+                          <w:pStyle w:val="12"/>
                           <w:spacing w:before="4"/>
                           <w:jc w:val="left"/>
                           <w:rPr>
@@ -9612,7 +9610,7 @@
                       </w:p>
                       <w:p>
                         <w:pPr>
-                          <w:pStyle w:val="11"/>
+                          <w:pStyle w:val="12"/>
                           <w:spacing w:before="0"/>
                           <w:rPr>
                             <w:sz w:val="24"/>
@@ -9636,7 +9634,7 @@
                       </w:tcPr>
                       <w:p>
                         <w:pPr>
-                          <w:pStyle w:val="11"/>
+                          <w:pStyle w:val="12"/>
                           <w:spacing w:before="4"/>
                           <w:jc w:val="left"/>
                           <w:rPr>
@@ -9646,7 +9644,7 @@
                       </w:p>
                       <w:p>
                         <w:pPr>
-                          <w:pStyle w:val="11"/>
+                          <w:pStyle w:val="12"/>
                           <w:spacing w:before="0"/>
                           <w:rPr>
                             <w:sz w:val="24"/>
@@ -9688,7 +9686,7 @@
                       </w:tcPr>
                       <w:p>
                         <w:pPr>
-                          <w:pStyle w:val="11"/>
+                          <w:pStyle w:val="12"/>
                           <w:ind w:left="60" w:right="60"/>
                           <w:rPr>
                             <w:sz w:val="24"/>
@@ -9708,7 +9706,7 @@
                       </w:tcPr>
                       <w:p>
                         <w:pPr>
-                          <w:pStyle w:val="11"/>
+                          <w:pStyle w:val="12"/>
                           <w:ind w:left="91" w:right="91"/>
                           <w:rPr>
                             <w:sz w:val="24"/>
@@ -9728,7 +9726,7 @@
                       </w:tcPr>
                       <w:p>
                         <w:pPr>
-                          <w:pStyle w:val="11"/>
+                          <w:pStyle w:val="12"/>
                           <w:ind w:left="87" w:right="87"/>
                           <w:rPr>
                             <w:sz w:val="24"/>
@@ -9769,7 +9767,7 @@
                       </w:tcPr>
                       <w:p>
                         <w:pPr>
-                          <w:pStyle w:val="11"/>
+                          <w:pStyle w:val="12"/>
                           <w:ind w:left="60" w:right="60"/>
                           <w:rPr>
                             <w:sz w:val="24"/>
@@ -9789,7 +9787,7 @@
                       </w:tcPr>
                       <w:p>
                         <w:pPr>
-                          <w:pStyle w:val="11"/>
+                          <w:pStyle w:val="12"/>
                           <w:ind w:left="91" w:right="91"/>
                           <w:rPr>
                             <w:sz w:val="24"/>
@@ -9809,7 +9807,7 @@
                       </w:tcPr>
                       <w:p>
                         <w:pPr>
-                          <w:pStyle w:val="11"/>
+                          <w:pStyle w:val="12"/>
                           <w:ind w:left="87" w:right="87"/>
                           <w:rPr>
                             <w:sz w:val="24"/>
@@ -9850,7 +9848,7 @@
                       </w:tcPr>
                       <w:p>
                         <w:pPr>
-                          <w:pStyle w:val="11"/>
+                          <w:pStyle w:val="12"/>
                           <w:ind w:left="60" w:right="60"/>
                           <w:rPr>
                             <w:sz w:val="24"/>
@@ -9870,7 +9868,7 @@
                       </w:tcPr>
                       <w:p>
                         <w:pPr>
-                          <w:pStyle w:val="11"/>
+                          <w:pStyle w:val="12"/>
                           <w:ind w:left="91" w:right="91"/>
                           <w:rPr>
                             <w:sz w:val="24"/>
@@ -9890,7 +9888,7 @@
                       </w:tcPr>
                       <w:p>
                         <w:pPr>
-                          <w:pStyle w:val="11"/>
+                          <w:pStyle w:val="12"/>
                           <w:ind w:left="87" w:right="87"/>
                           <w:rPr>
                             <w:sz w:val="24"/>
@@ -9931,7 +9929,7 @@
                       </w:tcPr>
                       <w:p>
                         <w:pPr>
-                          <w:pStyle w:val="11"/>
+                          <w:pStyle w:val="12"/>
                           <w:ind w:left="60" w:right="60"/>
                           <w:rPr>
                             <w:sz w:val="24"/>
@@ -9951,7 +9949,7 @@
                       </w:tcPr>
                       <w:p>
                         <w:pPr>
-                          <w:pStyle w:val="11"/>
+                          <w:pStyle w:val="12"/>
                           <w:ind w:left="91" w:right="91"/>
                           <w:rPr>
                             <w:sz w:val="24"/>
@@ -9971,7 +9969,7 @@
                       </w:tcPr>
                       <w:p>
                         <w:pPr>
-                          <w:pStyle w:val="11"/>
+                          <w:pStyle w:val="12"/>
                           <w:ind w:left="87" w:right="87"/>
                           <w:rPr>
                             <w:sz w:val="24"/>
@@ -10012,7 +10010,7 @@
                       </w:tcPr>
                       <w:p>
                         <w:pPr>
-                          <w:pStyle w:val="11"/>
+                          <w:pStyle w:val="12"/>
                           <w:spacing w:line="272" w:lineRule="exact"/>
                           <w:ind w:left="60" w:right="60"/>
                           <w:rPr>
@@ -10033,7 +10031,7 @@
                       </w:tcPr>
                       <w:p>
                         <w:pPr>
-                          <w:pStyle w:val="11"/>
+                          <w:pStyle w:val="12"/>
                           <w:spacing w:line="272" w:lineRule="exact"/>
                           <w:rPr>
                             <w:sz w:val="24"/>
@@ -10054,7 +10052,7 @@
                       </w:tcPr>
                       <w:p>
                         <w:pPr>
-                          <w:pStyle w:val="11"/>
+                          <w:pStyle w:val="12"/>
                           <w:spacing w:line="272" w:lineRule="exact"/>
                           <w:rPr>
                             <w:sz w:val="24"/>
@@ -10096,7 +10094,7 @@
                       </w:tcPr>
                       <w:p>
                         <w:pPr>
-                          <w:pStyle w:val="11"/>
+                          <w:pStyle w:val="12"/>
                           <w:spacing w:before="6"/>
                           <w:ind w:left="60" w:right="60"/>
                           <w:rPr>
@@ -10114,7 +10112,7 @@
                       </w:p>
                       <w:p>
                         <w:pPr>
-                          <w:pStyle w:val="11"/>
+                          <w:pStyle w:val="12"/>
                           <w:spacing w:before="23"/>
                           <w:ind w:left="60" w:right="60"/>
                           <w:rPr>
@@ -10135,7 +10133,7 @@
                       </w:tcPr>
                       <w:p>
                         <w:pPr>
-                          <w:pStyle w:val="11"/>
+                          <w:pStyle w:val="12"/>
                           <w:spacing w:before="6"/>
                           <w:jc w:val="left"/>
                           <w:rPr>
@@ -10145,7 +10143,7 @@
                       </w:p>
                       <w:p>
                         <w:pPr>
-                          <w:pStyle w:val="11"/>
+                          <w:pStyle w:val="12"/>
                           <w:spacing w:before="0"/>
                           <w:ind w:left="91" w:right="91"/>
                           <w:rPr>
@@ -10166,7 +10164,7 @@
                       </w:tcPr>
                       <w:p>
                         <w:pPr>
-                          <w:pStyle w:val="11"/>
+                          <w:pStyle w:val="12"/>
                           <w:spacing w:before="6"/>
                           <w:jc w:val="left"/>
                           <w:rPr>
@@ -10176,7 +10174,7 @@
                       </w:p>
                       <w:p>
                         <w:pPr>
-                          <w:pStyle w:val="11"/>
+                          <w:pStyle w:val="12"/>
                           <w:spacing w:before="0"/>
                           <w:ind w:left="87" w:right="87"/>
                           <w:rPr>
@@ -10218,7 +10216,7 @@
                       </w:tcPr>
                       <w:p>
                         <w:pPr>
-                          <w:pStyle w:val="11"/>
+                          <w:pStyle w:val="12"/>
                           <w:spacing w:line="272" w:lineRule="exact"/>
                           <w:ind w:left="60" w:right="60"/>
                           <w:rPr>
@@ -10239,7 +10237,7 @@
                       </w:tcPr>
                       <w:p>
                         <w:pPr>
-                          <w:pStyle w:val="11"/>
+                          <w:pStyle w:val="12"/>
                           <w:spacing w:line="272" w:lineRule="exact"/>
                           <w:ind w:left="91" w:right="91"/>
                           <w:rPr>
@@ -10260,7 +10258,7 @@
                       </w:tcPr>
                       <w:p>
                         <w:pPr>
-                          <w:pStyle w:val="11"/>
+                          <w:pStyle w:val="12"/>
                           <w:spacing w:line="272" w:lineRule="exact"/>
                           <w:ind w:left="87" w:right="87"/>
                           <w:rPr>
@@ -10302,7 +10300,7 @@
                       </w:tcPr>
                       <w:p>
                         <w:pPr>
-                          <w:pStyle w:val="11"/>
+                          <w:pStyle w:val="12"/>
                           <w:spacing w:before="6"/>
                           <w:ind w:left="60" w:right="60"/>
                           <w:rPr>
@@ -10320,7 +10318,7 @@
                       </w:p>
                       <w:p>
                         <w:pPr>
-                          <w:pStyle w:val="11"/>
+                          <w:pStyle w:val="12"/>
                           <w:spacing w:before="23"/>
                           <w:ind w:left="60" w:right="60"/>
                           <w:rPr>
@@ -10341,7 +10339,7 @@
                       </w:tcPr>
                       <w:p>
                         <w:pPr>
-                          <w:pStyle w:val="11"/>
+                          <w:pStyle w:val="12"/>
                           <w:spacing w:before="6"/>
                           <w:jc w:val="left"/>
                           <w:rPr>
@@ -10351,7 +10349,7 @@
                       </w:p>
                       <w:p>
                         <w:pPr>
-                          <w:pStyle w:val="11"/>
+                          <w:pStyle w:val="12"/>
                           <w:spacing w:before="0"/>
                           <w:ind w:left="91" w:right="91"/>
                           <w:rPr>
@@ -10372,7 +10370,7 @@
                       </w:tcPr>
                       <w:p>
                         <w:pPr>
-                          <w:pStyle w:val="11"/>
+                          <w:pStyle w:val="12"/>
                           <w:spacing w:before="6"/>
                           <w:jc w:val="left"/>
                           <w:rPr>
@@ -10382,7 +10380,7 @@
                       </w:p>
                       <w:p>
                         <w:pPr>
-                          <w:pStyle w:val="11"/>
+                          <w:pStyle w:val="12"/>
                           <w:spacing w:before="0"/>
                           <w:ind w:left="87" w:right="87"/>
                           <w:rPr>
@@ -10424,7 +10422,7 @@
                       </w:tcPr>
                       <w:p>
                         <w:pPr>
-                          <w:pStyle w:val="11"/>
+                          <w:pStyle w:val="12"/>
                           <w:spacing w:line="272" w:lineRule="exact"/>
                           <w:ind w:left="60" w:right="60"/>
                           <w:rPr>
@@ -10445,7 +10443,7 @@
                       </w:tcPr>
                       <w:p>
                         <w:pPr>
-                          <w:pStyle w:val="11"/>
+                          <w:pStyle w:val="12"/>
                           <w:spacing w:line="272" w:lineRule="exact"/>
                           <w:ind w:left="91" w:right="91"/>
                           <w:rPr>
@@ -10466,7 +10464,7 @@
                       </w:tcPr>
                       <w:p>
                         <w:pPr>
-                          <w:pStyle w:val="11"/>
+                          <w:pStyle w:val="12"/>
                           <w:spacing w:line="272" w:lineRule="exact"/>
                           <w:ind w:left="87" w:right="87"/>
                           <w:rPr>
@@ -10508,7 +10506,7 @@
                       </w:tcPr>
                       <w:p>
                         <w:pPr>
-                          <w:pStyle w:val="11"/>
+                          <w:pStyle w:val="12"/>
                           <w:spacing w:before="6"/>
                           <w:ind w:left="60" w:right="60"/>
                           <w:rPr>
@@ -10526,7 +10524,7 @@
                       </w:p>
                       <w:p>
                         <w:pPr>
-                          <w:pStyle w:val="11"/>
+                          <w:pStyle w:val="12"/>
                           <w:spacing w:before="23"/>
                           <w:ind w:left="60" w:right="60"/>
                           <w:rPr>
@@ -10547,7 +10545,7 @@
                       </w:tcPr>
                       <w:p>
                         <w:pPr>
-                          <w:pStyle w:val="11"/>
+                          <w:pStyle w:val="12"/>
                           <w:spacing w:before="6"/>
                           <w:jc w:val="left"/>
                           <w:rPr>
@@ -10557,7 +10555,7 @@
                       </w:p>
                       <w:p>
                         <w:pPr>
-                          <w:pStyle w:val="11"/>
+                          <w:pStyle w:val="12"/>
                           <w:spacing w:before="0"/>
                           <w:ind w:left="91" w:right="91"/>
                           <w:rPr>
@@ -10578,7 +10576,7 @@
                       </w:tcPr>
                       <w:p>
                         <w:pPr>
-                          <w:pStyle w:val="11"/>
+                          <w:pStyle w:val="12"/>
                           <w:spacing w:before="6"/>
                           <w:jc w:val="left"/>
                           <w:rPr>
@@ -10588,7 +10586,7 @@
                       </w:p>
                       <w:p>
                         <w:pPr>
-                          <w:pStyle w:val="11"/>
+                          <w:pStyle w:val="12"/>
                           <w:spacing w:before="0"/>
                           <w:ind w:left="87" w:right="87"/>
                           <w:rPr>
@@ -10630,7 +10628,7 @@
                       </w:tcPr>
                       <w:p>
                         <w:pPr>
-                          <w:pStyle w:val="11"/>
+                          <w:pStyle w:val="12"/>
                           <w:spacing w:line="272" w:lineRule="exact"/>
                           <w:ind w:left="60" w:right="60"/>
                           <w:rPr>
@@ -10651,7 +10649,7 @@
                       </w:tcPr>
                       <w:p>
                         <w:pPr>
-                          <w:pStyle w:val="11"/>
+                          <w:pStyle w:val="12"/>
                           <w:spacing w:line="272" w:lineRule="exact"/>
                           <w:ind w:left="91" w:right="91"/>
                           <w:rPr>
@@ -10672,7 +10670,7 @@
                       </w:tcPr>
                       <w:p>
                         <w:pPr>
-                          <w:pStyle w:val="11"/>
+                          <w:pStyle w:val="12"/>
                           <w:spacing w:line="272" w:lineRule="exact"/>
                           <w:ind w:left="87" w:right="87"/>
                           <w:rPr>
@@ -10714,7 +10712,7 @@
                       </w:tcPr>
                       <w:p>
                         <w:pPr>
-                          <w:pStyle w:val="11"/>
+                          <w:pStyle w:val="12"/>
                           <w:spacing w:before="6"/>
                           <w:ind w:left="60" w:right="60"/>
                           <w:rPr>
@@ -10732,7 +10730,7 @@
                       </w:p>
                       <w:p>
                         <w:pPr>
-                          <w:pStyle w:val="11"/>
+                          <w:pStyle w:val="12"/>
                           <w:spacing w:before="23"/>
                           <w:ind w:left="60" w:right="60"/>
                           <w:rPr>
@@ -10753,7 +10751,7 @@
                       </w:tcPr>
                       <w:p>
                         <w:pPr>
-                          <w:pStyle w:val="11"/>
+                          <w:pStyle w:val="12"/>
                           <w:spacing w:before="6"/>
                           <w:jc w:val="left"/>
                           <w:rPr>
@@ -10763,7 +10761,7 @@
                       </w:p>
                       <w:p>
                         <w:pPr>
-                          <w:pStyle w:val="11"/>
+                          <w:pStyle w:val="12"/>
                           <w:spacing w:before="0"/>
                           <w:rPr>
                             <w:sz w:val="24"/>
@@ -10784,7 +10782,7 @@
                       </w:tcPr>
                       <w:p>
                         <w:pPr>
-                          <w:pStyle w:val="11"/>
+                          <w:pStyle w:val="12"/>
                           <w:spacing w:before="6"/>
                           <w:jc w:val="left"/>
                           <w:rPr>
@@ -10794,7 +10792,7 @@
                       </w:p>
                       <w:p>
                         <w:pPr>
-                          <w:pStyle w:val="11"/>
+                          <w:pStyle w:val="12"/>
                           <w:spacing w:before="0"/>
                           <w:rPr>
                             <w:sz w:val="24"/>
@@ -10836,7 +10834,7 @@
                       </w:tcPr>
                       <w:p>
                         <w:pPr>
-                          <w:pStyle w:val="11"/>
+                          <w:pStyle w:val="12"/>
                           <w:ind w:left="60" w:right="60"/>
                           <w:rPr>
                             <w:sz w:val="24"/>
@@ -10856,7 +10854,7 @@
                       </w:tcPr>
                       <w:p>
                         <w:pPr>
-                          <w:pStyle w:val="11"/>
+                          <w:pStyle w:val="12"/>
                           <w:ind w:left="91" w:right="91"/>
                           <w:rPr>
                             <w:sz w:val="24"/>
@@ -10876,7 +10874,7 @@
                       </w:tcPr>
                       <w:p>
                         <w:pPr>
-                          <w:pStyle w:val="11"/>
+                          <w:pStyle w:val="12"/>
                           <w:rPr>
                             <w:sz w:val="24"/>
                           </w:rPr>
@@ -10917,7 +10915,7 @@
                       </w:tcPr>
                       <w:p>
                         <w:pPr>
-                          <w:pStyle w:val="11"/>
+                          <w:pStyle w:val="12"/>
                           <w:ind w:left="60" w:right="60"/>
                           <w:rPr>
                             <w:sz w:val="24"/>
@@ -10937,7 +10935,7 @@
                       </w:tcPr>
                       <w:p>
                         <w:pPr>
-                          <w:pStyle w:val="11"/>
+                          <w:pStyle w:val="12"/>
                           <w:rPr>
                             <w:sz w:val="24"/>
                           </w:rPr>
@@ -10957,7 +10955,7 @@
                       </w:tcPr>
                       <w:p>
                         <w:pPr>
-                          <w:pStyle w:val="11"/>
+                          <w:pStyle w:val="12"/>
                           <w:rPr>
                             <w:sz w:val="24"/>
                           </w:rPr>
@@ -10998,7 +10996,7 @@
                       </w:tcPr>
                       <w:p>
                         <w:pPr>
-                          <w:pStyle w:val="11"/>
+                          <w:pStyle w:val="12"/>
                           <w:ind w:left="60" w:right="60"/>
                           <w:rPr>
                             <w:sz w:val="24"/>
@@ -11018,7 +11016,7 @@
                       </w:tcPr>
                       <w:p>
                         <w:pPr>
-                          <w:pStyle w:val="11"/>
+                          <w:pStyle w:val="12"/>
                           <w:ind w:left="91" w:right="91"/>
                           <w:rPr>
                             <w:sz w:val="24"/>
@@ -11038,7 +11036,7 @@
                       </w:tcPr>
                       <w:p>
                         <w:pPr>
-                          <w:pStyle w:val="11"/>
+                          <w:pStyle w:val="12"/>
                           <w:ind w:left="87" w:right="87"/>
                           <w:rPr>
                             <w:sz w:val="24"/>
@@ -11079,7 +11077,7 @@
                       </w:tcPr>
                       <w:p>
                         <w:pPr>
-                          <w:pStyle w:val="11"/>
+                          <w:pStyle w:val="12"/>
                           <w:ind w:left="60" w:right="60"/>
                           <w:rPr>
                             <w:sz w:val="24"/>
@@ -11099,7 +11097,7 @@
                       </w:tcPr>
                       <w:p>
                         <w:pPr>
-                          <w:pStyle w:val="11"/>
+                          <w:pStyle w:val="12"/>
                           <w:rPr>
                             <w:sz w:val="24"/>
                           </w:rPr>
@@ -11119,7 +11117,7 @@
                       </w:tcPr>
                       <w:p>
                         <w:pPr>
-                          <w:pStyle w:val="11"/>
+                          <w:pStyle w:val="12"/>
                           <w:rPr>
                             <w:sz w:val="24"/>
                           </w:rPr>
@@ -11160,7 +11158,7 @@
                       </w:tcPr>
                       <w:p>
                         <w:pPr>
-                          <w:pStyle w:val="11"/>
+                          <w:pStyle w:val="12"/>
                           <w:ind w:left="60" w:right="60"/>
                           <w:rPr>
                             <w:sz w:val="24"/>
@@ -11180,7 +11178,7 @@
                       </w:tcPr>
                       <w:p>
                         <w:pPr>
-                          <w:pStyle w:val="11"/>
+                          <w:pStyle w:val="12"/>
                           <w:ind w:left="91" w:right="91"/>
                           <w:rPr>
                             <w:sz w:val="24"/>
@@ -11200,7 +11198,7 @@
                       </w:tcPr>
                       <w:p>
                         <w:pPr>
-                          <w:pStyle w:val="11"/>
+                          <w:pStyle w:val="12"/>
                           <w:ind w:left="87" w:right="87"/>
                           <w:rPr>
                             <w:sz w:val="24"/>
@@ -11244,7 +11242,7 @@
                       </w:tcPr>
                       <w:p>
                         <w:pPr>
-                          <w:pStyle w:val="11"/>
+                          <w:pStyle w:val="12"/>
                           <w:ind w:left="60" w:right="60"/>
                           <w:rPr>
                             <w:sz w:val="24"/>
@@ -11267,7 +11265,7 @@
                       </w:tcPr>
                       <w:p>
                         <w:pPr>
-                          <w:pStyle w:val="11"/>
+                          <w:pStyle w:val="12"/>
                           <w:rPr>
                             <w:sz w:val="24"/>
                           </w:rPr>
@@ -11290,7 +11288,7 @@
                       </w:tcPr>
                       <w:p>
                         <w:pPr>
-                          <w:pStyle w:val="11"/>
+                          <w:pStyle w:val="12"/>
                           <w:rPr>
                             <w:sz w:val="24"/>
                           </w:rPr>
@@ -13527,7 +13525,7 @@
     </w:p>
     <w:tbl>
       <w:tblPr>
-        <w:tblStyle w:val="7"/>
+        <w:tblStyle w:val="8"/>
         <w:tblW w:w="0" w:type="auto"/>
         <w:tblInd w:w="1356" w:type="dxa"/>
         <w:tblBorders>
@@ -13580,7 +13578,7 @@
           </w:tcPr>
           <w:p>
             <w:pPr>
-              <w:pStyle w:val="11"/>
+              <w:pStyle w:val="12"/>
               <w:spacing w:before="0" w:line="261" w:lineRule="exact"/>
               <w:ind w:left="117"/>
               <w:jc w:val="left"/>
@@ -13605,7 +13603,7 @@
           </w:tcPr>
           <w:p>
             <w:pPr>
-              <w:pStyle w:val="11"/>
+              <w:pStyle w:val="12"/>
               <w:spacing w:before="0" w:line="261" w:lineRule="exact"/>
               <w:ind w:left="614"/>
               <w:jc w:val="left"/>
@@ -13630,7 +13628,7 @@
           </w:tcPr>
           <w:p>
             <w:pPr>
-              <w:pStyle w:val="11"/>
+              <w:pStyle w:val="12"/>
               <w:spacing w:before="0" w:line="261" w:lineRule="exact"/>
               <w:ind w:right="806"/>
               <w:jc w:val="right"/>
@@ -13676,7 +13674,7 @@
           </w:tcPr>
           <w:p>
             <w:pPr>
-              <w:pStyle w:val="11"/>
+              <w:pStyle w:val="12"/>
               <w:ind w:left="117"/>
               <w:jc w:val="left"/>
               <w:rPr>
@@ -13700,7 +13698,7 @@
           </w:tcPr>
           <w:p>
             <w:pPr>
-              <w:pStyle w:val="11"/>
+              <w:pStyle w:val="12"/>
               <w:ind w:left="614"/>
               <w:jc w:val="left"/>
               <w:rPr>
@@ -13724,7 +13722,7 @@
           </w:tcPr>
           <w:p>
             <w:pPr>
-              <w:pStyle w:val="11"/>
+              <w:pStyle w:val="12"/>
               <w:ind w:right="835"/>
               <w:jc w:val="right"/>
               <w:rPr>
@@ -14671,34 +14669,26 @@
         <w:fldChar w:fldCharType="end"/>
       </w:r>
       <w:r>
-        <w:t>),</w:t>
+        <w:t>)</w:t>
+      </w:r>
+      <w:r>
+        <w:rPr>
+          <w:rFonts w:hint="eastAsia" w:eastAsia="宋体"/>
+          <w:lang w:val="en-US" w:eastAsia="zh-CN"/>
+        </w:rPr>
+        <w:t xml:space="preserve"> </w:t>
+      </w:r>
+      <w:r>
+        <w:t>and</w:t>
       </w:r>
       <w:r>
         <w:rPr>
           <w:spacing w:val="-13"/>
         </w:rPr>
-        <w:t xml:space="preserve"> </w:t>
-      </w:r>
-      <w:r>
-        <w:t>growth,</w:t>
-      </w:r>
-      <w:r>
-        <w:rPr>
-          <w:spacing w:val="-13"/>
-        </w:rPr>
-        <w:t xml:space="preserve"> </w:t>
-      </w:r>
-      <w:r>
-        <w:t>and</w:t>
-      </w:r>
-      <w:r>
-        <w:rPr>
-          <w:spacing w:val="-13"/>
-        </w:rPr>
-        <w:t xml:space="preserve"> </w:t>
-      </w:r>
-      <w:r>
-        <w:t>dissemiNACTion.</w:t>
+        <w:t xml:space="preserve">  </w:t>
+      </w:r>
+      <w:r>
+        <w:t>growth.</w:t>
       </w:r>
       <w:r>
         <w:rPr>
@@ -15695,9 +15685,18 @@
       </w:r>
       <w:r>
         <w:rPr>
+          <w:rFonts w:hint="eastAsia"/>
           <w:spacing w:val="-4"/>
         </w:rPr>
-        <w:t xml:space="preserve">aNACTomical </w:t>
+        <w:t>anatomical</w:t>
+      </w:r>
+      <w:r>
+        <w:rPr>
+          <w:rFonts w:hint="eastAsia" w:eastAsia="宋体"/>
+          <w:spacing w:val="-4"/>
+          <w:lang w:val="en-US" w:eastAsia="zh-CN"/>
+        </w:rPr>
+        <w:t xml:space="preserve"> </w:t>
       </w:r>
       <w:r>
         <w:t>factors for a more comprehensive assessment of the</w:t>
@@ -15727,9 +15726,11 @@
       </w:r>
       <w:r>
         <w:rPr>
+          <w:rFonts w:hint="eastAsia" w:eastAsia="宋体"/>
           <w:spacing w:val="-3"/>
-        </w:rPr>
-        <w:t xml:space="preserve">explaNACTion </w:t>
+          <w:lang w:val="en-US" w:eastAsia="zh-CN"/>
+        </w:rPr>
+        <w:t xml:space="preserve">explanation </w:t>
       </w:r>
       <w:r>
         <w:t>and training processes to increase the method’s applicability in real medical contexts.(</w:t>
@@ -16014,12 +16015,25 @@
       <w:pPr>
         <w:pStyle w:val="2"/>
         <w:spacing w:before="168"/>
+        <w:rPr>
+          <w:rFonts w:hint="eastAsia" w:eastAsia="宋体"/>
+          <w:lang w:val="en-US" w:eastAsia="zh-CN"/>
+        </w:rPr>
       </w:pPr>
       <w:r>
         <w:rPr>
+          <w:rFonts w:hint="eastAsia"/>
           <w:color w:val="231F20"/>
         </w:rPr>
-        <w:t>ETHICS STATEMENT</w:t>
+        <w:t>D</w:t>
+      </w:r>
+      <w:r>
+        <w:rPr>
+          <w:rFonts w:hint="eastAsia" w:eastAsia="宋体"/>
+          <w:color w:val="231F20"/>
+          <w:lang w:val="en-US" w:eastAsia="zh-CN"/>
+        </w:rPr>
+        <w:t>ECLARATIONS</w:t>
       </w:r>
     </w:p>
     <w:p>
@@ -16048,11 +16062,149 @@
     </w:p>
     <w:p>
       <w:pPr>
+        <w:pStyle w:val="2"/>
+        <w:spacing w:before="168"/>
+        <w:rPr>
+          <w:rFonts w:hint="eastAsia"/>
+        </w:rPr>
+      </w:pPr>
+      <w:r>
+        <w:rPr>
+          <w:rFonts w:hint="eastAsia"/>
+        </w:rPr>
+        <w:t>CONSENT FOR PUBLICATION</w:t>
+      </w:r>
+    </w:p>
+    <w:p>
+      <w:pPr>
         <w:pStyle w:val="4"/>
-        <w:rPr>
-          <w:sz w:val="28"/>
+        <w:spacing w:before="265" w:line="259" w:lineRule="auto"/>
+        <w:ind w:left="174" w:right="116" w:hanging="8"/>
+        <w:jc w:val="both"/>
+        <w:rPr>
+          <w:rFonts w:hint="eastAsia"/>
         </w:rPr>
       </w:pPr>
+      <w:r>
+        <w:rPr>
+          <w:rFonts w:hint="eastAsia"/>
+        </w:rPr>
+        <w:t xml:space="preserve"> Not applicable.</w:t>
+      </w:r>
+    </w:p>
+    <w:p>
+      <w:pPr>
+        <w:pStyle w:val="2"/>
+        <w:spacing w:before="168"/>
+      </w:pPr>
+      <w:r>
+        <w:rPr>
+          <w:color w:val="231F20"/>
+        </w:rPr>
+        <w:t>ETHICS STATEMENT</w:t>
+      </w:r>
+    </w:p>
+    <w:p>
+      <w:pPr>
+        <w:pStyle w:val="4"/>
+        <w:spacing w:before="265" w:line="259" w:lineRule="auto"/>
+        <w:ind w:left="174" w:right="116" w:hanging="8"/>
+        <w:jc w:val="both"/>
+        <w:rPr>
+          <w:rFonts w:hint="eastAsia"/>
+        </w:rPr>
+      </w:pPr>
+      <w:r>
+        <w:rPr>
+          <w:rFonts w:hint="eastAsia"/>
+        </w:rPr>
+        <w:t>All datasets in this study were downloaded from public databases, including</w:t>
+      </w:r>
+      <w:r>
+        <w:rPr>
+          <w:rFonts w:hint="eastAsia" w:eastAsia="宋体"/>
+          <w:lang w:val="en-US" w:eastAsia="zh-CN"/>
+        </w:rPr>
+        <w:t xml:space="preserve"> </w:t>
+      </w:r>
+      <w:r>
+        <w:rPr>
+          <w:rFonts w:hint="eastAsia"/>
+        </w:rPr>
+        <w:t>TCIA (https://www.cancerimagingarchive.net/) databases.These public databases allow researchers to download and analyse public datasets for scientific purposes.</w:t>
+      </w:r>
+    </w:p>
+    <w:p>
+      <w:pPr>
+        <w:pStyle w:val="2"/>
+        <w:spacing w:before="166"/>
+        <w:rPr>
+          <w:rFonts w:hint="eastAsia"/>
+          <w:color w:val="231F20"/>
+        </w:rPr>
+      </w:pPr>
+      <w:r>
+        <w:rPr>
+          <w:rFonts w:hint="eastAsia"/>
+          <w:color w:val="231F20"/>
+        </w:rPr>
+        <w:t>Abbreviations</w:t>
+      </w:r>
+    </w:p>
+    <w:p>
+      <w:pPr>
+        <w:pStyle w:val="6"/>
+        <w:keepNext w:val="0"/>
+        <w:keepLines w:val="0"/>
+        <w:widowControl/>
+        <w:suppressLineNumbers w:val="0"/>
+        <w:ind w:firstLine="240" w:firstLineChars="100"/>
+      </w:pPr>
+      <w:r>
+        <w:t>TNBC: Triple-Negative Breast Cancer</w:t>
+      </w:r>
+    </w:p>
+    <w:p>
+      <w:pPr>
+        <w:pStyle w:val="6"/>
+        <w:keepNext w:val="0"/>
+        <w:keepLines w:val="0"/>
+        <w:widowControl/>
+        <w:suppressLineNumbers w:val="0"/>
+        <w:ind w:firstLine="240" w:firstLineChars="100"/>
+      </w:pPr>
+      <w:r>
+        <w:t>HR: Hormone Receptor</w:t>
+      </w:r>
+    </w:p>
+    <w:p>
+      <w:pPr>
+        <w:pStyle w:val="6"/>
+        <w:keepNext w:val="0"/>
+        <w:keepLines w:val="0"/>
+        <w:widowControl/>
+        <w:suppressLineNumbers w:val="0"/>
+        <w:ind w:firstLine="240" w:firstLineChars="100"/>
+      </w:pPr>
+      <w:r>
+        <w:t>HER2: Human Epidermal Growth Factor Receptor 2</w:t>
+      </w:r>
+    </w:p>
+    <w:p>
+      <w:pPr>
+        <w:pStyle w:val="6"/>
+        <w:keepNext w:val="0"/>
+        <w:keepLines w:val="0"/>
+        <w:widowControl/>
+        <w:suppressLineNumbers w:val="0"/>
+        <w:ind w:firstLine="240" w:firstLineChars="100"/>
+        <w:rPr>
+          <w:rFonts w:hint="eastAsia"/>
+        </w:rPr>
+      </w:pPr>
+      <w:r>
+        <w:t>MRI: Magnetic Resonance Imaging</w:t>
+      </w:r>
     </w:p>
     <w:p>
       <w:pPr>
@@ -16080,6 +16232,14 @@
     <w:p>
       <w:pPr>
         <w:pStyle w:val="4"/>
+        <w:spacing w:before="264" w:line="259" w:lineRule="auto"/>
+        <w:ind w:left="174" w:right="146" w:hanging="8"/>
+        <w:jc w:val="both"/>
+      </w:pPr>
+    </w:p>
+    <w:p>
+      <w:pPr>
+        <w:pStyle w:val="4"/>
         <w:rPr>
           <w:sz w:val="28"/>
         </w:rPr>
@@ -16366,6 +16526,8 @@
       <w:r>
         <w:t>study</w:t>
       </w:r>
+      <w:bookmarkStart w:id="60" w:name="_GoBack"/>
+      <w:bookmarkEnd w:id="60"/>
       <w:r>
         <w:rPr>
           <w:spacing w:val="-19"/>
@@ -16492,6 +16654,80 @@
     <w:p>
       <w:pPr>
         <w:spacing w:after="0" w:line="242" w:lineRule="auto"/>
+      </w:pPr>
+    </w:p>
+    <w:p>
+      <w:pPr>
+        <w:pStyle w:val="2"/>
+        <w:spacing w:before="167"/>
+      </w:pPr>
+      <w:r>
+        <w:rPr>
+          <w:rFonts w:hint="eastAsia"/>
+          <w:color w:val="231F20"/>
+        </w:rPr>
+        <w:t>COMPETING INTERESTS</w:t>
+      </w:r>
+    </w:p>
+    <w:p>
+      <w:pPr>
+        <w:pStyle w:val="4"/>
+        <w:spacing w:before="265" w:line="242" w:lineRule="auto"/>
+        <w:ind w:left="174" w:right="117" w:hanging="8"/>
+        <w:rPr>
+          <w:rFonts w:hint="eastAsia"/>
+        </w:rPr>
+      </w:pPr>
+      <w:r>
+        <w:rPr>
+          <w:rFonts w:hint="eastAsia"/>
+        </w:rPr>
+        <w:t>The authors declare no competing interests.</w:t>
+      </w:r>
+    </w:p>
+    <w:p>
+      <w:pPr>
+        <w:pStyle w:val="2"/>
+        <w:spacing w:before="167"/>
+        <w:rPr>
+          <w:rFonts w:hint="eastAsia"/>
+          <w:color w:val="231F20"/>
+        </w:rPr>
+      </w:pPr>
+      <w:r>
+        <w:rPr>
+          <w:rFonts w:hint="eastAsia"/>
+          <w:color w:val="231F20"/>
+        </w:rPr>
+        <w:t>ACKNOWLEDGEMENTS</w:t>
+      </w:r>
+    </w:p>
+    <w:p>
+      <w:pPr>
+        <w:pStyle w:val="4"/>
+        <w:spacing w:before="265" w:line="242" w:lineRule="auto"/>
+        <w:ind w:left="174" w:right="117" w:hanging="8"/>
+        <w:sectPr>
+          <w:pgSz w:w="11910" w:h="16840"/>
+          <w:pgMar w:top="1180" w:right="760" w:bottom="1220" w:left="780" w:header="775" w:footer="1033" w:gutter="0"/>
+          <w:cols w:space="720" w:num="1"/>
+        </w:sectPr>
+      </w:pPr>
+      <w:r>
+        <w:rPr>
+          <w:rFonts w:hint="eastAsia"/>
+        </w:rPr>
+        <w:t xml:space="preserve">We are grateful to all those who contributed to this manuscript, and to the pioneers of research in related fields. </w:t>
+      </w:r>
+    </w:p>
+    <w:p>
+      <w:pPr>
+        <w:pStyle w:val="4"/>
+        <w:spacing w:before="265" w:line="242" w:lineRule="auto"/>
+        <w:ind w:left="174" w:right="117" w:hanging="8"/>
+        <w:rPr>
+          <w:rFonts w:hint="eastAsia"/>
+        </w:rPr>
         <w:sectPr>
           <w:pgSz w:w="11910" w:h="16840"/>
           <w:pgMar w:top="1180" w:right="760" w:bottom="1220" w:left="780" w:header="775" w:footer="1033" w:gutter="0"/>
@@ -16523,7 +16759,7 @@
     </w:p>
     <w:p>
       <w:pPr>
-        <w:pStyle w:val="10"/>
+        <w:pStyle w:val="11"/>
         <w:numPr>
           <w:ilvl w:val="0"/>
           <w:numId w:val="3"/>
@@ -16820,7 +17056,7 @@
     </w:p>
     <w:p>
       <w:pPr>
-        <w:pStyle w:val="10"/>
+        <w:pStyle w:val="11"/>
         <w:numPr>
           <w:ilvl w:val="0"/>
           <w:numId w:val="3"/>
@@ -17057,7 +17293,7 @@
     </w:p>
     <w:p>
       <w:pPr>
-        <w:pStyle w:val="10"/>
+        <w:pStyle w:val="11"/>
         <w:numPr>
           <w:ilvl w:val="0"/>
           <w:numId w:val="3"/>
@@ -17280,7 +17516,7 @@
     </w:p>
     <w:p>
       <w:pPr>
-        <w:pStyle w:val="10"/>
+        <w:pStyle w:val="11"/>
         <w:numPr>
           <w:ilvl w:val="0"/>
           <w:numId w:val="3"/>
@@ -17543,7 +17779,7 @@
     </w:p>
     <w:p>
       <w:pPr>
-        <w:pStyle w:val="10"/>
+        <w:pStyle w:val="11"/>
         <w:numPr>
           <w:ilvl w:val="0"/>
           <w:numId w:val="3"/>
@@ -17654,7 +17890,7 @@
     </w:p>
     <w:p>
       <w:pPr>
-        <w:pStyle w:val="10"/>
+        <w:pStyle w:val="11"/>
         <w:numPr>
           <w:ilvl w:val="0"/>
           <w:numId w:val="3"/>
@@ -17759,7 +17995,7 @@
     </w:p>
     <w:p>
       <w:pPr>
-        <w:pStyle w:val="10"/>
+        <w:pStyle w:val="11"/>
         <w:numPr>
           <w:ilvl w:val="0"/>
           <w:numId w:val="3"/>
@@ -17891,7 +18127,7 @@
     </w:p>
     <w:p>
       <w:pPr>
-        <w:pStyle w:val="10"/>
+        <w:pStyle w:val="11"/>
         <w:numPr>
           <w:ilvl w:val="0"/>
           <w:numId w:val="3"/>
@@ -18308,7 +18544,7 @@
     </w:p>
     <w:p>
       <w:pPr>
-        <w:pStyle w:val="10"/>
+        <w:pStyle w:val="11"/>
         <w:numPr>
           <w:ilvl w:val="0"/>
           <w:numId w:val="3"/>
@@ -18386,7 +18622,7 @@
     </w:p>
     <w:p>
       <w:pPr>
-        <w:pStyle w:val="10"/>
+        <w:pStyle w:val="11"/>
         <w:numPr>
           <w:ilvl w:val="0"/>
           <w:numId w:val="3"/>
@@ -18470,7 +18706,7 @@
     </w:p>
     <w:p>
       <w:pPr>
-        <w:pStyle w:val="10"/>
+        <w:pStyle w:val="11"/>
         <w:numPr>
           <w:ilvl w:val="0"/>
           <w:numId w:val="3"/>
@@ -18724,7 +18960,7 @@
     </w:p>
     <w:p>
       <w:pPr>
-        <w:pStyle w:val="10"/>
+        <w:pStyle w:val="11"/>
         <w:numPr>
           <w:ilvl w:val="0"/>
           <w:numId w:val="3"/>
@@ -18782,7 +19018,7 @@
     </w:p>
     <w:p>
       <w:pPr>
-        <w:pStyle w:val="10"/>
+        <w:pStyle w:val="11"/>
         <w:numPr>
           <w:ilvl w:val="0"/>
           <w:numId w:val="3"/>
@@ -18855,7 +19091,7 @@
     </w:p>
     <w:p>
       <w:pPr>
-        <w:pStyle w:val="10"/>
+        <w:pStyle w:val="11"/>
         <w:numPr>
           <w:ilvl w:val="0"/>
           <w:numId w:val="3"/>
@@ -19092,7 +19328,7 @@
     </w:p>
     <w:p>
       <w:pPr>
-        <w:pStyle w:val="10"/>
+        <w:pStyle w:val="11"/>
         <w:numPr>
           <w:ilvl w:val="0"/>
           <w:numId w:val="3"/>
@@ -19193,7 +19429,7 @@
     </w:p>
     <w:p>
       <w:pPr>
-        <w:pStyle w:val="10"/>
+        <w:pStyle w:val="11"/>
         <w:numPr>
           <w:ilvl w:val="0"/>
           <w:numId w:val="3"/>
@@ -19288,7 +19524,7 @@
     </w:p>
     <w:p>
       <w:pPr>
-        <w:pStyle w:val="10"/>
+        <w:pStyle w:val="11"/>
         <w:numPr>
           <w:ilvl w:val="0"/>
           <w:numId w:val="3"/>
@@ -19378,7 +19614,7 @@
     </w:p>
     <w:p>
       <w:pPr>
-        <w:pStyle w:val="10"/>
+        <w:pStyle w:val="11"/>
         <w:numPr>
           <w:ilvl w:val="0"/>
           <w:numId w:val="3"/>
@@ -19507,7 +19743,7 @@
     </w:p>
     <w:p>
       <w:pPr>
-        <w:pStyle w:val="10"/>
+        <w:pStyle w:val="11"/>
         <w:numPr>
           <w:ilvl w:val="0"/>
           <w:numId w:val="3"/>
@@ -19605,7 +19841,7 @@
     </w:p>
     <w:p>
       <w:pPr>
-        <w:pStyle w:val="10"/>
+        <w:pStyle w:val="11"/>
         <w:numPr>
           <w:ilvl w:val="0"/>
           <w:numId w:val="3"/>
@@ -19868,7 +20104,7 @@
     </w:p>
     <w:p>
       <w:pPr>
-        <w:pStyle w:val="10"/>
+        <w:pStyle w:val="11"/>
         <w:numPr>
           <w:ilvl w:val="0"/>
           <w:numId w:val="3"/>
@@ -20142,7 +20378,7 @@
     </w:p>
     <w:p>
       <w:pPr>
-        <w:pStyle w:val="10"/>
+        <w:pStyle w:val="11"/>
         <w:numPr>
           <w:ilvl w:val="0"/>
           <w:numId w:val="3"/>
@@ -20429,7 +20665,7 @@
     </w:p>
     <w:p>
       <w:pPr>
-        <w:pStyle w:val="10"/>
+        <w:pStyle w:val="11"/>
         <w:numPr>
           <w:ilvl w:val="0"/>
           <w:numId w:val="3"/>
@@ -20828,7 +21064,7 @@
     </w:p>
     <w:p>
       <w:pPr>
-        <w:pStyle w:val="10"/>
+        <w:pStyle w:val="11"/>
         <w:numPr>
           <w:ilvl w:val="0"/>
           <w:numId w:val="3"/>
@@ -21046,7 +21282,7 @@
     </w:p>
     <w:p>
       <w:pPr>
-        <w:pStyle w:val="10"/>
+        <w:pStyle w:val="11"/>
         <w:numPr>
           <w:ilvl w:val="0"/>
           <w:numId w:val="3"/>
@@ -21289,7 +21525,7 @@
     </w:p>
     <w:p>
       <w:pPr>
-        <w:pStyle w:val="10"/>
+        <w:pStyle w:val="11"/>
         <w:numPr>
           <w:ilvl w:val="0"/>
           <w:numId w:val="3"/>
@@ -21367,7 +21603,7 @@
     </w:p>
     <w:p>
       <w:pPr>
-        <w:pStyle w:val="10"/>
+        <w:pStyle w:val="11"/>
         <w:numPr>
           <w:ilvl w:val="0"/>
           <w:numId w:val="3"/>
@@ -21570,7 +21806,7 @@
     </w:p>
     <w:p>
       <w:pPr>
-        <w:pStyle w:val="10"/>
+        <w:pStyle w:val="11"/>
         <w:numPr>
           <w:ilvl w:val="0"/>
           <w:numId w:val="3"/>
@@ -22420,7 +22656,7 @@
   <w:docDefaults>
     <w:rPrDefault>
       <w:rPr>
-        <w:rFonts w:asciiTheme="minorHAnsi" w:hAnsiTheme="minorHAnsi" w:eastAsiaTheme="minorHAnsi" w:cstheme="minorBidi"/>
+        <w:rFonts w:ascii="Times New Roman" w:hAnsi="Times New Roman" w:eastAsia="宋体" w:cs="Times New Roman"/>
       </w:rPr>
     </w:rPrDefault>
     <w:pPrDefault/>
@@ -22729,14 +22965,14 @@
       <w:szCs w:val="24"/>
     </w:rPr>
   </w:style>
-  <w:style w:type="character" w:default="1" w:styleId="8">
+  <w:style w:type="character" w:default="1" w:styleId="9">
     <w:name w:val="Default Paragraph Font"/>
     <w:semiHidden/>
     <w:unhideWhenUsed/>
     <w:qFormat/>
     <w:uiPriority w:val="1"/>
   </w:style>
-  <w:style w:type="table" w:default="1" w:styleId="7">
+  <w:style w:type="table" w:default="1" w:styleId="8">
     <w:name w:val="Normal Table"/>
     <w:semiHidden/>
     <w:qFormat/>
@@ -22787,6 +23023,21 @@
     </w:rPr>
   </w:style>
   <w:style w:type="paragraph" w:styleId="6">
+    <w:name w:val="Normal (Web)"/>
+    <w:basedOn w:val="1"/>
+    <w:uiPriority w:val="0"/>
+    <w:pPr>
+      <w:spacing w:before="0" w:beforeAutospacing="1" w:after="0" w:afterAutospacing="1"/>
+      <w:ind w:left="0" w:right="0"/>
+      <w:jc w:val="left"/>
+    </w:pPr>
+    <w:rPr>
+      <w:kern w:val="0"/>
+      <w:sz w:val="24"/>
+      <w:lang w:val="en-US" w:eastAsia="zh-CN" w:bidi="ar"/>
+    </w:rPr>
+  </w:style>
+  <w:style w:type="paragraph" w:styleId="7">
     <w:name w:val="Title"/>
     <w:basedOn w:val="1"/>
     <w:qFormat/>
@@ -22803,7 +23054,7 @@
       <w:szCs w:val="40"/>
     </w:rPr>
   </w:style>
-  <w:style w:type="table" w:customStyle="1" w:styleId="9">
+  <w:style w:type="table" w:customStyle="1" w:styleId="10">
     <w:name w:val="Table Normal"/>
     <w:semiHidden/>
     <w:unhideWhenUsed/>
@@ -22818,7 +23069,7 @@
       </w:tblCellMar>
     </w:tblPr>
   </w:style>
-  <w:style w:type="paragraph" w:styleId="10">
+  <w:style w:type="paragraph" w:styleId="11">
     <w:name w:val="List Paragraph"/>
     <w:basedOn w:val="1"/>
     <w:qFormat/>
@@ -22831,7 +23082,7 @@
       <w:rFonts w:ascii="Times New Roman" w:hAnsi="Times New Roman" w:eastAsia="Times New Roman" w:cs="Times New Roman"/>
     </w:rPr>
   </w:style>
-  <w:style w:type="paragraph" w:customStyle="1" w:styleId="11">
+  <w:style w:type="paragraph" w:customStyle="1" w:styleId="12">
     <w:name w:val="Table Paragraph"/>
     <w:basedOn w:val="1"/>
     <w:qFormat/>
@@ -23143,6 +23394,7 @@
     <customSectPr/>
     <customSectPr/>
     <customSectPr/>
+    <customSectPr/>
   </customSectProps>
   <customShpExts>
     <customShpInfo spid="_x0000_s2049"/>

</xml_diff>